<commit_message>
Semana 6 - Validação TAM (capítulo dedicado).
</commit_message>
<xml_diff>
--- a/Cronograma_Defesa_Dissertacao.docx
+++ b/Cronograma_Defesa_Dissertacao.docx
@@ -2332,10 +2332,14 @@
           <w:p>
             <w:pPr>
               <w:cnfStyle w:val="000000100000" w:firstRow="0" w:lastRow="0" w:firstColumn="0" w:lastColumn="0" w:oddVBand="0" w:evenVBand="0" w:oddHBand="1" w:evenHBand="0" w:firstRowFirstColumn="0" w:firstRowLastColumn="0" w:lastRowFirstColumn="0" w:lastRowLastColumn="0"/>
-            </w:pPr>
-            <w:r>
-              <w:rPr>
-                <w:sz w:val="20"/>
+              <w:rPr>
+                <w:highlight w:val="green"/>
+              </w:rPr>
+            </w:pPr>
+            <w:r>
+              <w:rPr>
+                <w:sz w:val="20"/>
+                <w:highlight w:val="green"/>
               </w:rPr>
               <w:t>Adicionar seção 7.7 Generalização para múltiplos ODS (ODS 3, ODS 4) com configurações ods3_</w:t>
             </w:r>
@@ -2343,6 +2347,7 @@
             <w:r>
               <w:rPr>
                 <w:sz w:val="20"/>
+                <w:highlight w:val="green"/>
               </w:rPr>
               <w:t>config.json</w:t>
             </w:r>
@@ -2350,6 +2355,7 @@
             <w:r>
               <w:rPr>
                 <w:sz w:val="20"/>
+                <w:highlight w:val="green"/>
               </w:rPr>
               <w:t xml:space="preserve"> e ods4_</w:t>
             </w:r>
@@ -2357,6 +2363,7 @@
             <w:r>
               <w:rPr>
                 <w:sz w:val="20"/>
+                <w:highlight w:val="green"/>
               </w:rPr>
               <w:t>config.json</w:t>
             </w:r>
@@ -2426,10 +2433,14 @@
           <w:p>
             <w:pPr>
               <w:cnfStyle w:val="000000010000" w:firstRow="0" w:lastRow="0" w:firstColumn="0" w:lastColumn="0" w:oddVBand="0" w:evenVBand="0" w:oddHBand="0" w:evenHBand="1" w:firstRowFirstColumn="0" w:firstRowLastColumn="0" w:lastRowFirstColumn="0" w:lastRowLastColumn="0"/>
-            </w:pPr>
-            <w:r>
-              <w:rPr>
-                <w:sz w:val="20"/>
+              <w:rPr>
+                <w:highlight w:val="green"/>
+              </w:rPr>
+            </w:pPr>
+            <w:r>
+              <w:rPr>
+                <w:sz w:val="20"/>
+                <w:highlight w:val="green"/>
               </w:rPr>
               <w:t>Adicionar seção 7.8 Generalização geográfica (Natal, Fortaleza, João Pessoa, Salvador) — mostrar arquivos *_</w:t>
             </w:r>
@@ -2437,6 +2448,7 @@
             <w:r>
               <w:rPr>
                 <w:sz w:val="20"/>
+                <w:highlight w:val="green"/>
               </w:rPr>
               <w:t>analise</w:t>
             </w:r>
@@ -2444,6 +2456,7 @@
             <w:r>
               <w:rPr>
                 <w:sz w:val="20"/>
+                <w:highlight w:val="green"/>
               </w:rPr>
               <w:t>_</w:t>
             </w:r>
@@ -2451,6 +2464,7 @@
             <w:r>
               <w:rPr>
                 <w:sz w:val="20"/>
+                <w:highlight w:val="green"/>
               </w:rPr>
               <w:t>*.</w:t>
             </w:r>
@@ -2458,6 +2472,7 @@
             <w:r>
               <w:rPr>
                 <w:sz w:val="20"/>
+                <w:highlight w:val="green"/>
               </w:rPr>
               <w:t>json</w:t>
             </w:r>
@@ -2466,6 +2481,7 @@
             <w:r>
               <w:rPr>
                 <w:sz w:val="20"/>
+                <w:highlight w:val="green"/>
               </w:rPr>
               <w:t xml:space="preserve"> em outras cidades</w:t>
             </w:r>
@@ -2534,10 +2550,14 @@
           <w:p>
             <w:pPr>
               <w:cnfStyle w:val="000000100000" w:firstRow="0" w:lastRow="0" w:firstColumn="0" w:lastColumn="0" w:oddVBand="0" w:evenVBand="0" w:oddHBand="1" w:evenHBand="0" w:firstRowFirstColumn="0" w:firstRowLastColumn="0" w:lastRowFirstColumn="0" w:lastRowLastColumn="0"/>
-            </w:pPr>
-            <w:r>
-              <w:rPr>
-                <w:sz w:val="20"/>
+              <w:rPr>
+                <w:highlight w:val="green"/>
+              </w:rPr>
+            </w:pPr>
+            <w:r>
+              <w:rPr>
+                <w:sz w:val="20"/>
+                <w:highlight w:val="green"/>
               </w:rPr>
               <w:t>Adicionar seção 7.9 Formulário interativo de configuração (formulario_config_ods.html + ods_analise_generica.py) com screenshot e fluxo de uso</w:t>
             </w:r>
@@ -2606,10 +2626,14 @@
           <w:p>
             <w:pPr>
               <w:cnfStyle w:val="000000010000" w:firstRow="0" w:lastRow="0" w:firstColumn="0" w:lastColumn="0" w:oddVBand="0" w:evenVBand="0" w:oddHBand="0" w:evenHBand="1" w:firstRowFirstColumn="0" w:firstRowLastColumn="0" w:lastRowFirstColumn="0" w:lastRowLastColumn="0"/>
-            </w:pPr>
-            <w:r>
-              <w:rPr>
-                <w:sz w:val="20"/>
+              <w:rPr>
+                <w:highlight w:val="green"/>
+              </w:rPr>
+            </w:pPr>
+            <w:r>
+              <w:rPr>
+                <w:sz w:val="20"/>
+                <w:highlight w:val="green"/>
               </w:rPr>
               <w:t>Adicionar seção 7.10 Dashboards Web Públicos — substituir/complementar a referência a Power BI pelo dashboard hospedado em Netlify (dashboard-</w:t>
             </w:r>
@@ -2617,6 +2641,7 @@
             <w:r>
               <w:rPr>
                 <w:sz w:val="20"/>
+                <w:highlight w:val="green"/>
               </w:rPr>
               <w:t>ods</w:t>
             </w:r>
@@ -2624,6 +2649,7 @@
             <w:r>
               <w:rPr>
                 <w:sz w:val="20"/>
+                <w:highlight w:val="green"/>
               </w:rPr>
               <w:t>-</w:t>
             </w:r>
@@ -2631,6 +2657,7 @@
             <w:r>
               <w:rPr>
                 <w:sz w:val="20"/>
+                <w:highlight w:val="green"/>
               </w:rPr>
               <w:t>mossoro.netlify.app</w:t>
             </w:r>
@@ -2638,6 +2665,7 @@
             <w:r>
               <w:rPr>
                 <w:sz w:val="20"/>
+                <w:highlight w:val="green"/>
               </w:rPr>
               <w:t>)</w:t>
             </w:r>
@@ -2913,10 +2941,14 @@
           <w:p>
             <w:pPr>
               <w:cnfStyle w:val="000000100000" w:firstRow="0" w:lastRow="0" w:firstColumn="0" w:lastColumn="0" w:oddVBand="0" w:evenVBand="0" w:oddHBand="1" w:evenHBand="0" w:firstRowFirstColumn="0" w:firstRowLastColumn="0" w:lastRowFirstColumn="0" w:lastRowLastColumn="0"/>
-            </w:pPr>
-            <w:r>
-              <w:rPr>
-                <w:sz w:val="20"/>
+              <w:rPr>
+                <w:highlight w:val="green"/>
+              </w:rPr>
+            </w:pPr>
+            <w:r>
+              <w:rPr>
+                <w:sz w:val="20"/>
+                <w:highlight w:val="green"/>
               </w:rPr>
               <w:t>Resultados ODS 9 (253 análises, 117 lugares, 56,9% problemas, distribuição por dimensão, tabelas/figuras) — adaptar §6 do EATIS expandindo a análise por dimensão</w:t>
             </w:r>
@@ -2985,10 +3017,14 @@
           <w:p>
             <w:pPr>
               <w:cnfStyle w:val="000000010000" w:firstRow="0" w:lastRow="0" w:firstColumn="0" w:lastColumn="0" w:oddVBand="0" w:evenVBand="0" w:oddHBand="0" w:evenHBand="1" w:firstRowFirstColumn="0" w:firstRowLastColumn="0" w:lastRowFirstColumn="0" w:lastRowLastColumn="0"/>
-            </w:pPr>
-            <w:r>
-              <w:rPr>
-                <w:sz w:val="20"/>
+              <w:rPr>
+                <w:highlight w:val="green"/>
+              </w:rPr>
+            </w:pPr>
+            <w:r>
+              <w:rPr>
+                <w:sz w:val="20"/>
+                <w:highlight w:val="green"/>
               </w:rPr>
               <w:t>Resultados ODS 16 (116 análises, 12 estabelecimentos, 46,6%, dimensão Instituições Eficazes 37,1%) — adaptar §6 do EATIS</w:t>
             </w:r>
@@ -3057,10 +3093,14 @@
           <w:p>
             <w:pPr>
               <w:cnfStyle w:val="000000100000" w:firstRow="0" w:lastRow="0" w:firstColumn="0" w:lastColumn="0" w:oddVBand="0" w:evenVBand="0" w:oddHBand="1" w:evenHBand="0" w:firstRowFirstColumn="0" w:firstRowLastColumn="0" w:lastRowFirstColumn="0" w:lastRowLastColumn="0"/>
-            </w:pPr>
-            <w:r>
-              <w:rPr>
-                <w:sz w:val="20"/>
+              <w:rPr>
+                <w:highlight w:val="green"/>
+              </w:rPr>
+            </w:pPr>
+            <w:r>
+              <w:rPr>
+                <w:sz w:val="20"/>
+                <w:highlight w:val="green"/>
               </w:rPr>
               <w:t>Inserir gráficos do EATIS em alta resolução (Figura 1 — distribuição de sentimentos comparada; Figura 2 — problemas por dimensão ODS 16)</w:t>
             </w:r>
@@ -3457,18 +3497,21 @@
             <w:r>
               <w:rPr>
                 <w:sz w:val="20"/>
+                <w:highlight w:val="green"/>
               </w:rPr>
               <w:t>Diagnósticos automáticos gerados pela IA — exemplos representativos (1 por ODS</w:t>
             </w:r>
             <w:r>
               <w:rPr>
                 <w:sz w:val="20"/>
+                <w:highlight w:val="green"/>
               </w:rPr>
               <w:t>, apenas ODS 9 e 16</w:t>
             </w:r>
             <w:r>
               <w:rPr>
                 <w:sz w:val="20"/>
+                <w:highlight w:val="green"/>
               </w:rPr>
               <w:t>)</w:t>
             </w:r>
@@ -3662,10 +3705,14 @@
           <w:p>
             <w:pPr>
               <w:cnfStyle w:val="000000100000" w:firstRow="0" w:lastRow="0" w:firstColumn="0" w:lastColumn="0" w:oddVBand="0" w:evenVBand="0" w:oddHBand="1" w:evenHBand="0" w:firstRowFirstColumn="0" w:firstRowLastColumn="0" w:lastRowFirstColumn="0" w:lastRowLastColumn="0"/>
-            </w:pPr>
-            <w:r>
-              <w:rPr>
-                <w:sz w:val="20"/>
+              <w:rPr>
+                <w:highlight w:val="green"/>
+              </w:rPr>
+            </w:pPr>
+            <w:r>
+              <w:rPr>
+                <w:sz w:val="20"/>
+                <w:highlight w:val="green"/>
               </w:rPr>
               <w:t xml:space="preserve">Subseção em Materiais e Métodos: descrever o instrumento TAM (Davis, 1989) — PU, PFU, ICU, escala </w:t>
             </w:r>
@@ -3673,6 +3720,7 @@
             <w:r>
               <w:rPr>
                 <w:sz w:val="20"/>
+                <w:highlight w:val="green"/>
               </w:rPr>
               <w:t>Likert</w:t>
             </w:r>
@@ -3680,6 +3728,7 @@
             <w:r>
               <w:rPr>
                 <w:sz w:val="20"/>
+                <w:highlight w:val="green"/>
               </w:rPr>
               <w:t>, perguntas abertas, link do dashboard avaliado</w:t>
             </w:r>
@@ -3748,10 +3797,14 @@
           <w:p>
             <w:pPr>
               <w:cnfStyle w:val="000000010000" w:firstRow="0" w:lastRow="0" w:firstColumn="0" w:lastColumn="0" w:oddVBand="0" w:evenVBand="0" w:oddHBand="0" w:evenHBand="1" w:firstRowFirstColumn="0" w:firstRowLastColumn="0" w:lastRowFirstColumn="0" w:lastRowLastColumn="0"/>
-            </w:pPr>
-            <w:r>
-              <w:rPr>
-                <w:sz w:val="20"/>
+              <w:rPr>
+                <w:highlight w:val="green"/>
+              </w:rPr>
+            </w:pPr>
+            <w:r>
+              <w:rPr>
+                <w:sz w:val="20"/>
+                <w:highlight w:val="green"/>
               </w:rPr>
               <w:t>Capítulo/seção de Validação TAM</w:t>
             </w:r>
@@ -3820,10 +3873,14 @@
           <w:p>
             <w:pPr>
               <w:cnfStyle w:val="000000100000" w:firstRow="0" w:lastRow="0" w:firstColumn="0" w:lastColumn="0" w:oddVBand="0" w:evenVBand="0" w:oddHBand="1" w:evenHBand="0" w:firstRowFirstColumn="0" w:firstRowLastColumn="0" w:lastRowFirstColumn="0" w:lastRowLastColumn="0"/>
-            </w:pPr>
-            <w:r>
-              <w:rPr>
-                <w:sz w:val="20"/>
+              <w:rPr>
+                <w:highlight w:val="green"/>
+              </w:rPr>
+            </w:pPr>
+            <w:r>
+              <w:rPr>
+                <w:sz w:val="20"/>
+                <w:highlight w:val="green"/>
               </w:rPr>
               <w:t>Tabular respostas (PU1, PU2, PU3, PFU1, PFU2, PFU3, ICU1, ICU2 + escalas 1-5 + ranqueamento) e calcular médias por construto</w:t>
             </w:r>
@@ -3892,16 +3949,21 @@
           <w:p>
             <w:pPr>
               <w:cnfStyle w:val="000000010000" w:firstRow="0" w:lastRow="0" w:firstColumn="0" w:lastColumn="0" w:oddVBand="0" w:evenVBand="0" w:oddHBand="0" w:evenHBand="1" w:firstRowFirstColumn="0" w:firstRowLastColumn="0" w:lastRowFirstColumn="0" w:lastRowLastColumn="0"/>
-            </w:pPr>
-            <w:r>
-              <w:rPr>
-                <w:sz w:val="20"/>
+              <w:rPr>
+                <w:highlight w:val="green"/>
+              </w:rPr>
+            </w:pPr>
+            <w:r>
+              <w:rPr>
+                <w:sz w:val="20"/>
+                <w:highlight w:val="green"/>
               </w:rPr>
               <w:t>Análise qualitativa das respostas abertas (sugestão de filtros tipo Excel, excelente iniciativa, nenhum problema encontrado) + ameaças à validade do TAM com n=</w:t>
             </w:r>
             <w:r>
               <w:rPr>
                 <w:sz w:val="20"/>
+                <w:highlight w:val="green"/>
               </w:rPr>
               <w:t>5</w:t>
             </w:r>

</xml_diff>

<commit_message>
Semana 8 - Conclusão e ajustes finos
</commit_message>
<xml_diff>
--- a/Cronograma_Defesa_Dissertacao.docx
+++ b/Cronograma_Defesa_Dissertacao.docx
@@ -4157,10 +4157,14 @@
           <w:p>
             <w:pPr>
               <w:cnfStyle w:val="000000100000" w:firstRow="0" w:lastRow="0" w:firstColumn="0" w:lastColumn="0" w:oddVBand="0" w:evenVBand="0" w:oddHBand="1" w:evenHBand="0" w:firstRowFirstColumn="0" w:firstRowLastColumn="0" w:lastRowFirstColumn="0" w:lastRowLastColumn="0"/>
-            </w:pPr>
-            <w:r>
-              <w:rPr>
-                <w:sz w:val="20"/>
+              <w:rPr>
+                <w:highlight w:val="green"/>
+              </w:rPr>
+            </w:pPr>
+            <w:r>
+              <w:rPr>
+                <w:sz w:val="20"/>
+                <w:highlight w:val="green"/>
               </w:rPr>
               <w:t>Discussão dos resultados quantitativos: por que ODS 9 tem mais neutros (normalização de problemas crônicos) — usar §7 do EATIS</w:t>
             </w:r>
@@ -4229,10 +4233,14 @@
           <w:p>
             <w:pPr>
               <w:cnfStyle w:val="000000010000" w:firstRow="0" w:lastRow="0" w:firstColumn="0" w:lastColumn="0" w:oddVBand="0" w:evenVBand="0" w:oddHBand="0" w:evenHBand="1" w:firstRowFirstColumn="0" w:firstRowLastColumn="0" w:lastRowFirstColumn="0" w:lastRowLastColumn="0"/>
-            </w:pPr>
-            <w:r>
-              <w:rPr>
-                <w:sz w:val="20"/>
+              <w:rPr>
+                <w:highlight w:val="green"/>
+              </w:rPr>
+            </w:pPr>
+            <w:r>
+              <w:rPr>
+                <w:sz w:val="20"/>
+                <w:highlight w:val="green"/>
               </w:rPr>
               <w:t>Discussão da generalização: o que mudou em outras cidades; estabilidade dos padrões</w:t>
             </w:r>
@@ -4301,10 +4309,14 @@
           <w:p>
             <w:pPr>
               <w:cnfStyle w:val="000000100000" w:firstRow="0" w:lastRow="0" w:firstColumn="0" w:lastColumn="0" w:oddVBand="0" w:evenVBand="0" w:oddHBand="1" w:evenHBand="0" w:firstRowFirstColumn="0" w:firstRowLastColumn="0" w:lastRowFirstColumn="0" w:lastRowLastColumn="0"/>
-            </w:pPr>
-            <w:r>
-              <w:rPr>
-                <w:sz w:val="20"/>
+              <w:rPr>
+                <w:highlight w:val="green"/>
+              </w:rPr>
+            </w:pPr>
+            <w:r>
+              <w:rPr>
+                <w:sz w:val="20"/>
+                <w:highlight w:val="green"/>
               </w:rPr>
               <w:t>Discussão da aceitação tecnológica (TAM): triangulação com o resultado quantitativo dos dashboards</w:t>
             </w:r>
@@ -4373,10 +4385,14 @@
           <w:p>
             <w:pPr>
               <w:cnfStyle w:val="000000010000" w:firstRow="0" w:lastRow="0" w:firstColumn="0" w:lastColumn="0" w:oddVBand="0" w:evenVBand="0" w:oddHBand="0" w:evenHBand="1" w:firstRowFirstColumn="0" w:firstRowLastColumn="0" w:lastRowFirstColumn="0" w:lastRowLastColumn="0"/>
-            </w:pPr>
-            <w:r>
-              <w:rPr>
-                <w:sz w:val="20"/>
+              <w:rPr>
+                <w:highlight w:val="green"/>
+              </w:rPr>
+            </w:pPr>
+            <w:r>
+              <w:rPr>
+                <w:sz w:val="20"/>
+                <w:highlight w:val="green"/>
               </w:rPr>
               <w:t>Limitações: viés de seleção/digital, cobertura desigual, temporalidade, viés de termos de busca, n pequeno do TAM (§7 do EATIS já traz)</w:t>
             </w:r>
@@ -4445,10 +4461,14 @@
           <w:p>
             <w:pPr>
               <w:cnfStyle w:val="000000100000" w:firstRow="0" w:lastRow="0" w:firstColumn="0" w:lastColumn="0" w:oddVBand="0" w:evenVBand="0" w:oddHBand="1" w:evenHBand="0" w:firstRowFirstColumn="0" w:firstRowLastColumn="0" w:lastRowFirstColumn="0" w:lastRowLastColumn="0"/>
-            </w:pPr>
-            <w:r>
-              <w:rPr>
-                <w:sz w:val="20"/>
+              <w:rPr>
+                <w:highlight w:val="green"/>
+              </w:rPr>
+            </w:pPr>
+            <w:r>
+              <w:rPr>
+                <w:sz w:val="20"/>
+                <w:highlight w:val="green"/>
               </w:rPr>
               <w:t>Implicações para Smart Cities e gestão pública municipal</w:t>
             </w:r>
@@ -5092,16 +5112,14 @@
               <w:rPr>
                 <w:sz w:val="20"/>
               </w:rPr>
-              <w:t>), arquivos de configuração JSON exemplares, link do repositório/</w:t>
-            </w:r>
-            <w:proofErr w:type="spellStart"/>
-            <w:r>
-              <w:rPr>
-                <w:sz w:val="20"/>
-              </w:rPr>
-              <w:t>Zenodo</w:t>
-            </w:r>
-            <w:proofErr w:type="spellEnd"/>
+              <w:t>), arquivos de configuração JSON exemplares</w:t>
+            </w:r>
+            <w:r>
+              <w:rPr>
+                <w:sz w:val="20"/>
+              </w:rPr>
+              <w:t>.</w:t>
+            </w:r>
           </w:p>
         </w:tc>
         <w:tc>
@@ -5523,6 +5541,7 @@
           <w:rFonts w:ascii="Calibri" w:hAnsi="Calibri"/>
           <w:color w:val="1F3A68"/>
         </w:rPr>
+        <w:lastRenderedPageBreak/>
         <w:t>4. Marcos principais (resumo)</w:t>
       </w:r>
     </w:p>

</xml_diff>